<commit_message>
Ajustes nas documentações dos extras do NRZL
</commit_message>
<xml_diff>
--- a/nrz_l/docs/tutorial_simulacao_NRZL.docx
+++ b/nrz_l/docs/tutorial_simulacao_NRZL.docx
@@ -1030,7 +1030,7 @@
           <w:p>
             <w:pPr>
               <w:rPr>
-                <w:rFonts w:ascii="Courier New" w:eastAsia="Courier New" w:hAnsi="Courier New" w:cs="Courier New"/>
+                <w:rFonts w:ascii="Courier New" w:hAnsi="Courier New" w:cs="Courier New"/>
                 <w:sz w:val="18"/>
                 <w:szCs w:val="18"/>
               </w:rPr>
@@ -1054,26 +1054,6 @@
               <w:t>/</w:t>
             </w:r>
           </w:p>
-        </w:tc>
-      </w:tr>
-      <w:tr>
-        <w:tc>
-          <w:tcPr>
-            <w:tcW w:w="9026" w:type="dxa"/>
-            <w:tcBorders>
-              <w:top w:val="none" w:sz="0" w:space="0" w:color="FFFFFF"/>
-              <w:left w:val="none" w:sz="0" w:space="0" w:color="FFFFFF"/>
-              <w:bottom w:val="none" w:sz="0" w:space="0" w:color="FFFFFF"/>
-              <w:right w:val="none" w:sz="0" w:space="0" w:color="FFFFFF"/>
-            </w:tcBorders>
-            <w:shd w:val="clear" w:color="auto" w:fill="F2F2F2"/>
-            <w:tcMar>
-              <w:top w:w="40" w:type="dxa"/>
-              <w:left w:w="180" w:type="dxa"/>
-              <w:bottom w:w="40" w:type="dxa"/>
-              <w:right w:w="180" w:type="dxa"/>
-            </w:tcMar>
-          </w:tcPr>
           <w:p>
             <w:pPr>
               <w:rPr>

</xml_diff>